<commit_message>
fix(fnd): 다중 클라이언트 FND 충돌 시 ERR FND_BUSY 로 거부
- server/command.c: 다른 클라이언트가 7세그(FND) 사용 중이면
  FND <n> / FND STOP 모두 ERR FND_BUSY 로 거부, 소유 클라의 카운트다운 유지
  (같은 클라이언트의 재시작은 허용, 연결 종료 시 자동 해제)
- 기존엔 단일 전역 g_fnd_sock 이라 B가 FND 시작 시 A의 출력이 끊기던 문제
- 문서 반영: README, 개발문서(.docx §4.2.4·§6.2·§6.3·§10), Notion API 명세서(§2.4·§4), CLAUDE.md

Closes #10
</commit_message>
<xml_diff>
--- a/개발문서_TCP원격장치제어시스템.docx
+++ b/개발문서_TCP원격장치제어시스템.docx
@@ -4403,6 +4403,63 @@
     </w:p>
     <w:p>
       <w:pPr>
+        <w:spacing w:before="60" w:after="60" w:line="320" w:lineRule="auto"/>
+      </w:pPr>
+      <w:r>
+        <w:rPr>
+          <w:b/>
+          <w:color w:val="000000"/>
+        </w:rPr>
+        <w:t xml:space="preserve">다중 클라이언트</w:t>
+      </w:r>
+      <w:r>
+        <w:rPr>
+          <w:color w:val="000000"/>
+        </w:rPr>
+        <w:t xml:space="preserve">: 7세그는 물리적으로 1개뿐이라, 다른 클라이언트가 카운트다운 중이면 </w:t>
+      </w:r>
+      <w:r>
+        <w:rPr>
+          <w:rFonts w:ascii="Consolas" w:hAnsi="Consolas"/>
+          <w:color w:val="A31515"/>
+        </w:rPr>
+        <w:t xml:space="preserve">FND</w:t>
+      </w:r>
+      <w:r>
+        <w:rPr>
+          <w:color w:val="000000"/>
+        </w:rPr>
+        <w:t xml:space="preserve">/</w:t>
+      </w:r>
+      <w:r>
+        <w:rPr>
+          <w:rFonts w:ascii="Consolas" w:hAnsi="Consolas"/>
+          <w:color w:val="A31515"/>
+        </w:rPr>
+        <w:t xml:space="preserve">FND STOP</w:t>
+      </w:r>
+      <w:r>
+        <w:rPr>
+          <w:color w:val="000000"/>
+        </w:rPr>
+        <w:t xml:space="preserve">은 </w:t>
+      </w:r>
+      <w:r>
+        <w:rPr>
+          <w:rFonts w:ascii="Consolas" w:hAnsi="Consolas"/>
+          <w:color w:val="A31515"/>
+        </w:rPr>
+        <w:t xml:space="preserve">ERR FND_BUSY</w:t>
+      </w:r>
+      <w:r>
+        <w:rPr>
+          <w:color w:val="000000"/>
+        </w:rPr>
+        <w:t xml:space="preserve">로 거부하고 소유 클라이언트의 카운트다운을 유지한다(같은 클라이언트의 재시작은 허용, 연결 종료 시 자동 해제).</w:t>
+      </w:r>
+    </w:p>
+    <w:p>
+      <w:pPr>
         <w:pStyle w:val="3"/>
       </w:pPr>
       <w:r>
@@ -6993,6 +7050,23 @@
                 <w:sz w:val="20"/>
                 <w:szCs w:val="20"/>
               </w:rPr>
+              <w:t xml:space="preserve">, 사용 중이면 </w:t>
+            </w:r>
+            <w:r>
+              <w:rPr>
+                <w:color w:val="000000"/>
+                <w:rFonts w:ascii="Consolas" w:hAnsi="Consolas"/>
+                <w:sz w:val="20"/>
+                <w:szCs w:val="20"/>
+              </w:rPr>
+              <w:t xml:space="preserve">ERR FND_BUSY</w:t>
+            </w:r>
+            <w:r>
+              <w:rPr>
+                <w:color w:val="000000"/>
+                <w:sz w:val="20"/>
+                <w:szCs w:val="20"/>
+              </w:rPr>
               <w:t xml:space="preserve">)</w:t>
             </w:r>
           </w:p>
@@ -7073,6 +7147,31 @@
                 <w:szCs w:val="20"/>
               </w:rPr>
               <w:t xml:space="preserve">OK FND STOP</w:t>
+            </w:r>
+            <w:r>
+              <w:rPr>
+                <w:color w:val="000000"/>
+                <w:sz w:val="20"/>
+                <w:szCs w:val="20"/>
+              </w:rPr>
+              <w:t xml:space="preserve"> (사용 중이면 </w:t>
+            </w:r>
+            <w:r>
+              <w:rPr>
+                <w:color w:val="000000"/>
+                <w:rFonts w:ascii="Consolas" w:hAnsi="Consolas"/>
+                <w:sz w:val="20"/>
+                <w:szCs w:val="20"/>
+              </w:rPr>
+              <w:t xml:space="preserve">ERR FND_BUSY</w:t>
+            </w:r>
+            <w:r>
+              <w:rPr>
+                <w:color w:val="000000"/>
+                <w:sz w:val="20"/>
+                <w:szCs w:val="20"/>
+              </w:rPr>
+              <w:t xml:space="preserve">)</w:t>
             </w:r>
           </w:p>
         </w:tc>
@@ -7891,6 +7990,59 @@
           </w:p>
         </w:tc>
       </w:tr>
+      <w:tr>
+        <w:tc>
+          <w:tcPr>
+            <w:tcW w:w="3008" w:type="dxa"/>
+            <w:tcMar>
+              <w:top w:w="40" w:type="dxa"/>
+              <w:left w:w="100" w:type="dxa"/>
+              <w:bottom w:w="40" w:type="dxa"/>
+              <w:right w:w="100" w:type="dxa"/>
+            </w:tcMar>
+            <w:vAlign w:val="center"/>
+          </w:tcPr>
+          <w:p>
+            <w:pPr>
+              <w:spacing w:before="20" w:after="20" w:line="260" w:lineRule="auto"/>
+            </w:pPr>
+            <w:r>
+              <w:rPr>
+                <w:color w:val="000000"/>
+                <w:rFonts w:ascii="Consolas" w:hAnsi="Consolas"/>
+                <w:sz w:val="20"/>
+                <w:szCs w:val="20"/>
+              </w:rPr>
+              <w:t xml:space="preserve">ERR FND_BUSY</w:t>
+            </w:r>
+          </w:p>
+        </w:tc>
+        <w:tc>
+          <w:tcPr>
+            <w:tcW w:w="6017" w:type="dxa"/>
+            <w:tcMar>
+              <w:top w:w="40" w:type="dxa"/>
+              <w:left w:w="100" w:type="dxa"/>
+              <w:bottom w:w="40" w:type="dxa"/>
+              <w:right w:w="100" w:type="dxa"/>
+            </w:tcMar>
+            <w:vAlign w:val="center"/>
+          </w:tcPr>
+          <w:p>
+            <w:pPr>
+              <w:spacing w:before="20" w:after="20" w:line="260" w:lineRule="auto"/>
+            </w:pPr>
+            <w:r>
+              <w:rPr>
+                <w:color w:val="000000"/>
+                <w:sz w:val="20"/>
+                <w:szCs w:val="20"/>
+              </w:rPr>
+              <w:t xml:space="preserve">다른 클라이언트가 7세그(FND) 사용 중 — 소유 클라이언트만 제어 가능</w:t>
+            </w:r>
+          </w:p>
+        </w:tc>
+      </w:tr>
     </w:tbl>
     <w:p>
       <w:pPr>
@@ -11436,7 +11588,7 @@
                 <w:sz w:val="20"/>
                 <w:szCs w:val="20"/>
               </w:rPr>
-              <w:t xml:space="preserve">개발문서·README·실행과정 text → 15시 제출</w:t>
+              <w:t xml:space="preserve">개발문서·README·동영상 실연 → 15시 제출</w:t>
             </w:r>
           </w:p>
         </w:tc>
@@ -12522,6 +12674,142 @@
                 <w:szCs w:val="20"/>
               </w:rPr>
               <w:t xml:space="preserve"> 한 번 보내고 자동 모드 종료(오류값으로 LED 제어 안 함)</w:t>
+            </w:r>
+          </w:p>
+        </w:tc>
+      </w:tr>
+      <w:tr>
+        <w:tc>
+          <w:tcPr>
+            <w:tcW w:w="530" w:type="dxa"/>
+            <w:tcMar>
+              <w:top w:w="40" w:type="dxa"/>
+              <w:left w:w="100" w:type="dxa"/>
+              <w:bottom w:w="40" w:type="dxa"/>
+              <w:right w:w="100" w:type="dxa"/>
+            </w:tcMar>
+            <w:vAlign w:val="center"/>
+          </w:tcPr>
+          <w:p>
+            <w:pPr>
+              <w:spacing w:before="20" w:after="20" w:line="260" w:lineRule="auto"/>
+            </w:pPr>
+            <w:r>
+              <w:rPr>
+                <w:color w:val="000000"/>
+                <w:sz w:val="20"/>
+                <w:szCs w:val="20"/>
+              </w:rPr>
+              <w:t xml:space="preserve">8</w:t>
+            </w:r>
+          </w:p>
+        </w:tc>
+        <w:tc>
+          <w:tcPr>
+            <w:tcW w:w="2654" w:type="dxa"/>
+            <w:tcMar>
+              <w:top w:w="40" w:type="dxa"/>
+              <w:left w:w="100" w:type="dxa"/>
+              <w:bottom w:w="40" w:type="dxa"/>
+              <w:right w:w="100" w:type="dxa"/>
+            </w:tcMar>
+            <w:vAlign w:val="center"/>
+          </w:tcPr>
+          <w:p>
+            <w:pPr>
+              <w:spacing w:before="20" w:after="20" w:line="260" w:lineRule="auto"/>
+            </w:pPr>
+            <w:r>
+              <w:rPr>
+                <w:color w:val="000000"/>
+                <w:sz w:val="20"/>
+                <w:szCs w:val="20"/>
+              </w:rPr>
+              <w:t xml:space="preserve">다중 클라에서 A의 FND 카운트다운이 B의 FND 시작에 끊김</w:t>
+            </w:r>
+          </w:p>
+        </w:tc>
+        <w:tc>
+          <w:tcPr>
+            <w:tcW w:w="2123" w:type="dxa"/>
+            <w:tcMar>
+              <w:top w:w="40" w:type="dxa"/>
+              <w:left w:w="100" w:type="dxa"/>
+              <w:bottom w:w="40" w:type="dxa"/>
+              <w:right w:w="100" w:type="dxa"/>
+            </w:tcMar>
+            <w:vAlign w:val="center"/>
+          </w:tcPr>
+          <w:p>
+            <w:pPr>
+              <w:spacing w:before="20" w:after="20" w:line="260" w:lineRule="auto"/>
+            </w:pPr>
+            <w:r>
+              <w:rPr>
+                <w:color w:val="000000"/>
+                <w:sz w:val="20"/>
+                <w:szCs w:val="20"/>
+              </w:rPr>
+              <w:t xml:space="preserve">FND가 단일 전역 모드(</w:t>
+            </w:r>
+            <w:r>
+              <w:rPr>
+                <w:color w:val="000000"/>
+                <w:rFonts w:ascii="Consolas" w:hAnsi="Consolas"/>
+                <w:sz w:val="20"/>
+                <w:szCs w:val="20"/>
+              </w:rPr>
+              <w:t xml:space="preserve">g_fnd_sock</w:t>
+            </w:r>
+            <w:r>
+              <w:rPr>
+                <w:color w:val="000000"/>
+                <w:sz w:val="20"/>
+                <w:szCs w:val="20"/>
+              </w:rPr>
+              <w:t xml:space="preserve">)라 소켓이 B로 바뀜</w:t>
+            </w:r>
+          </w:p>
+        </w:tc>
+        <w:tc>
+          <w:tcPr>
+            <w:tcW w:w="3716" w:type="dxa"/>
+            <w:tcMar>
+              <w:top w:w="40" w:type="dxa"/>
+              <w:left w:w="100" w:type="dxa"/>
+              <w:bottom w:w="40" w:type="dxa"/>
+              <w:right w:w="100" w:type="dxa"/>
+            </w:tcMar>
+            <w:vAlign w:val="center"/>
+          </w:tcPr>
+          <w:p>
+            <w:pPr>
+              <w:spacing w:before="20" w:after="20" w:line="260" w:lineRule="auto"/>
+            </w:pPr>
+            <w:r>
+              <w:rPr>
+                <w:color w:val="000000"/>
+                <w:sz w:val="20"/>
+                <w:szCs w:val="20"/>
+              </w:rPr>
+              <w:t xml:space="preserve">다른 클라 사용 중이면 </w:t>
+            </w:r>
+            <w:r>
+              <w:rPr>
+                <w:color w:val="000000"/>
+                <w:rFonts w:ascii="Consolas" w:hAnsi="Consolas"/>
+                <w:sz w:val="20"/>
+                <w:szCs w:val="20"/>
+              </w:rPr>
+              <w:t xml:space="preserve">ERR FND_BUSY</w:t>
+            </w:r>
+            <w:r>
+              <w:rPr>
+                <w:color w:val="000000"/>
+                <w:sz w:val="20"/>
+                <w:szCs w:val="20"/>
+              </w:rPr>
+              <w:t xml:space="preserve">로 거부, 소유 클라만 제어(같은 클라 재시작 허용)</w:t>
             </w:r>
           </w:p>
         </w:tc>

</xml_diff>